<commit_message>
6 use case description 수정, 6,7,8 UI 수정
</commit_message>
<xml_diff>
--- a/UseCaseDescription/UseCaseDescription_C251022.docx
+++ b/UseCaseDescription/UseCaseDescription_C251022.docx
@@ -190,7 +190,6 @@
             </w:tcMar>
           </w:tcPr>
           <w:p>
-            <w:proofErr w:type="spellStart"/>
             <w:r>
               <w:rPr>
                 <w:rFonts w:eastAsia="Arial"/>
@@ -200,9 +199,64 @@
                 <w:sz w:val="20"/>
                 <w:szCs w:val="20"/>
               </w:rPr>
-              <w:t>액터</w:t>
-            </w:r>
-            <w:proofErr w:type="spellEnd"/>
+              <w:t>액터 (Actor)</w:t>
+            </w:r>
+          </w:p>
+        </w:tc>
+        <w:tc>
+          <w:tcPr>
+            <w:tcW w:w="7360" w:type="dxa"/>
+            <w:tcBorders>
+              <w:top w:val="single" w:sz="1" w:space="0" w:color="CCCCCC"/>
+              <w:left w:val="single" w:sz="1" w:space="0" w:color="CCCCCC"/>
+              <w:bottom w:val="single" w:sz="1" w:space="0" w:color="CCCCCC"/>
+              <w:right w:val="single" w:sz="1" w:space="0" w:color="CCCCCC"/>
+            </w:tcBorders>
+            <w:tcMar>
+              <w:top w:w="80" w:type="dxa"/>
+              <w:left w:w="150" w:type="dxa"/>
+              <w:bottom w:w="80" w:type="dxa"/>
+              <w:right w:w="150" w:type="dxa"/>
+            </w:tcMar>
+          </w:tcPr>
+          <w:p>
+            <w:pPr>
+              <w:rPr>
+                <w:rFonts w:ascii="함초롬바탕" w:eastAsia="함초롬바탕" w:hAnsi="함초롬바탕" w:cs="함초롬바탕"/>
+                <w:sz w:val="20"/>
+                <w:szCs w:val="20"/>
+              </w:rPr>
+            </w:pPr>
+            <w:r>
+              <w:rPr>
+                <w:rFonts w:ascii="함초롬바탕" w:eastAsia="함초롬바탕" w:hAnsi="함초롬바탕" w:cs="함초롬바탕" w:hint="eastAsia"/>
+                <w:sz w:val="20"/>
+                <w:szCs w:val="20"/>
+              </w:rPr>
+              <w:t>관리자</w:t>
+            </w:r>
+          </w:p>
+        </w:tc>
+      </w:tr>
+      <w:tr>
+        <w:tc>
+          <w:tcPr>
+            <w:tcW w:w="2000" w:type="dxa"/>
+            <w:tcBorders>
+              <w:top w:val="single" w:sz="1" w:space="0" w:color="CCCCCC"/>
+              <w:left w:val="single" w:sz="1" w:space="0" w:color="CCCCCC"/>
+              <w:bottom w:val="single" w:sz="1" w:space="0" w:color="CCCCCC"/>
+              <w:right w:val="single" w:sz="1" w:space="0" w:color="CCCCCC"/>
+            </w:tcBorders>
+            <w:shd w:val="clear" w:color="auto" w:fill="EEF2F8"/>
+            <w:tcMar>
+              <w:top w:w="80" w:type="dxa"/>
+              <w:left w:w="150" w:type="dxa"/>
+              <w:bottom w:w="80" w:type="dxa"/>
+              <w:right w:w="150" w:type="dxa"/>
+            </w:tcMar>
+          </w:tcPr>
+          <w:p>
             <w:r>
               <w:rPr>
                 <w:rFonts w:eastAsia="Arial"/>
@@ -212,7 +266,7 @@
                 <w:sz w:val="20"/>
                 <w:szCs w:val="20"/>
               </w:rPr>
-              <w:t xml:space="preserve"> (Actor)</w:t>
+              <w:t>목표 (Goal)</w:t>
             </w:r>
           </w:p>
         </w:tc>
@@ -236,73 +290,6 @@
             <w:pPr>
               <w:rPr>
                 <w:rFonts w:ascii="함초롬바탕" w:eastAsia="함초롬바탕" w:hAnsi="함초롬바탕" w:cs="함초롬바탕"/>
-                <w:sz w:val="20"/>
-                <w:szCs w:val="20"/>
-              </w:rPr>
-            </w:pPr>
-            <w:r>
-              <w:rPr>
-                <w:rFonts w:ascii="함초롬바탕" w:eastAsia="함초롬바탕" w:hAnsi="함초롬바탕" w:cs="함초롬바탕" w:hint="eastAsia"/>
-                <w:sz w:val="20"/>
-                <w:szCs w:val="20"/>
-              </w:rPr>
-              <w:t>관리자</w:t>
-            </w:r>
-          </w:p>
-        </w:tc>
-      </w:tr>
-      <w:tr>
-        <w:tc>
-          <w:tcPr>
-            <w:tcW w:w="2000" w:type="dxa"/>
-            <w:tcBorders>
-              <w:top w:val="single" w:sz="1" w:space="0" w:color="CCCCCC"/>
-              <w:left w:val="single" w:sz="1" w:space="0" w:color="CCCCCC"/>
-              <w:bottom w:val="single" w:sz="1" w:space="0" w:color="CCCCCC"/>
-              <w:right w:val="single" w:sz="1" w:space="0" w:color="CCCCCC"/>
-            </w:tcBorders>
-            <w:shd w:val="clear" w:color="auto" w:fill="EEF2F8"/>
-            <w:tcMar>
-              <w:top w:w="80" w:type="dxa"/>
-              <w:left w:w="150" w:type="dxa"/>
-              <w:bottom w:w="80" w:type="dxa"/>
-              <w:right w:w="150" w:type="dxa"/>
-            </w:tcMar>
-          </w:tcPr>
-          <w:p>
-            <w:r>
-              <w:rPr>
-                <w:rFonts w:eastAsia="Arial"/>
-                <w:b/>
-                <w:bCs/>
-                <w:color w:val="2E5496"/>
-                <w:sz w:val="20"/>
-                <w:szCs w:val="20"/>
-              </w:rPr>
-              <w:t>목표 (Goal)</w:t>
-            </w:r>
-          </w:p>
-        </w:tc>
-        <w:tc>
-          <w:tcPr>
-            <w:tcW w:w="7360" w:type="dxa"/>
-            <w:tcBorders>
-              <w:top w:val="single" w:sz="1" w:space="0" w:color="CCCCCC"/>
-              <w:left w:val="single" w:sz="1" w:space="0" w:color="CCCCCC"/>
-              <w:bottom w:val="single" w:sz="1" w:space="0" w:color="CCCCCC"/>
-              <w:right w:val="single" w:sz="1" w:space="0" w:color="CCCCCC"/>
-            </w:tcBorders>
-            <w:tcMar>
-              <w:top w:w="80" w:type="dxa"/>
-              <w:left w:w="150" w:type="dxa"/>
-              <w:bottom w:w="80" w:type="dxa"/>
-              <w:right w:w="150" w:type="dxa"/>
-            </w:tcMar>
-          </w:tcPr>
-          <w:p>
-            <w:pPr>
-              <w:rPr>
-                <w:rFonts w:ascii="함초롬바탕" w:eastAsia="함초롬바탕" w:hAnsi="함초롬바탕" w:cs="함초롬바탕" w:hint="eastAsia"/>
                 <w:sz w:val="20"/>
                 <w:szCs w:val="20"/>
               </w:rPr>
@@ -609,6 +596,106 @@
                 <w:szCs w:val="20"/>
               </w:rPr>
               <w:t>등록된 모든 설문 리스트를 보여준다.</w:t>
+            </w:r>
+          </w:p>
+        </w:tc>
+      </w:tr>
+      <w:tr>
+        <w:trPr>
+          <w:trHeight w:val="300"/>
+        </w:trPr>
+        <w:tc>
+          <w:tcPr>
+            <w:tcW w:w="9360" w:type="dxa"/>
+            <w:gridSpan w:val="2"/>
+            <w:tcBorders>
+              <w:top w:val="single" w:sz="1" w:space="0" w:color="CCCCCC"/>
+              <w:left w:val="single" w:sz="1" w:space="0" w:color="CCCCCC"/>
+              <w:bottom w:val="single" w:sz="1" w:space="0" w:color="CCCCCC"/>
+              <w:right w:val="single" w:sz="1" w:space="0" w:color="CCCCCC"/>
+            </w:tcBorders>
+            <w:shd w:val="clear" w:color="auto" w:fill="FFFFFF" w:themeFill="background1"/>
+            <w:tcMar>
+              <w:top w:w="100" w:type="dxa"/>
+              <w:left w:w="150" w:type="dxa"/>
+              <w:bottom w:w="100" w:type="dxa"/>
+              <w:right w:w="150" w:type="dxa"/>
+            </w:tcMar>
+            <w:vAlign w:val="center"/>
+          </w:tcPr>
+          <w:p>
+            <w:pPr>
+              <w:rPr>
+                <w:rFonts w:ascii="함초롬바탕" w:eastAsia="함초롬바탕" w:hAnsi="함초롬바탕" w:cs="함초롬바탕" w:hint="eastAsia"/>
+                <w:color w:val="000000"/>
+                <w:sz w:val="20"/>
+                <w:szCs w:val="20"/>
+              </w:rPr>
+            </w:pPr>
+            <w:r>
+              <w:rPr>
+                <w:rFonts w:ascii="함초롬바탕" w:eastAsia="함초롬바탕" w:hAnsi="함초롬바탕" w:cs="함초롬바탕" w:hint="eastAsia"/>
+                <w:color w:val="000000"/>
+                <w:sz w:val="20"/>
+                <w:szCs w:val="20"/>
+              </w:rPr>
+              <w:t>Extensions</w:t>
+            </w:r>
+          </w:p>
+          <w:p>
+            <w:pPr>
+              <w:rPr>
+                <w:rFonts w:ascii="함초롬바탕" w:eastAsia="함초롬바탕" w:hAnsi="함초롬바탕" w:cs="함초롬바탕"/>
+                <w:color w:val="000000"/>
+                <w:sz w:val="20"/>
+                <w:szCs w:val="20"/>
+              </w:rPr>
+            </w:pPr>
+            <w:r>
+              <w:rPr>
+                <w:rFonts w:ascii="함초롬바탕" w:eastAsia="함초롬바탕" w:hAnsi="함초롬바탕" w:cs="함초롬바탕" w:hint="eastAsia"/>
+                <w:color w:val="000000"/>
+                <w:sz w:val="20"/>
+                <w:szCs w:val="20"/>
+              </w:rPr>
+              <w:t>2단계 이후, 관리자는 설문 상세 조회를 수행할 수 있다. (UC-06-01로 확장)</w:t>
+            </w:r>
+          </w:p>
+          <w:p>
+            <w:pPr>
+              <w:rPr>
+                <w:rFonts w:ascii="함초롬바탕" w:eastAsia="함초롬바탕" w:hAnsi="함초롬바탕" w:cs="함초롬바탕" w:hint="eastAsia"/>
+                <w:color w:val="000000"/>
+                <w:sz w:val="20"/>
+                <w:szCs w:val="20"/>
+              </w:rPr>
+            </w:pPr>
+            <w:r>
+              <w:rPr>
+                <w:rFonts w:ascii="함초롬바탕" w:eastAsia="함초롬바탕" w:hAnsi="함초롬바탕" w:cs="함초롬바탕" w:hint="eastAsia"/>
+                <w:color w:val="000000"/>
+                <w:sz w:val="20"/>
+                <w:szCs w:val="20"/>
+              </w:rPr>
+              <w:t>2단계 이후, 관리자는 특정 설문을 삭제할 수 있다. (UC-06-2</w:t>
+            </w:r>
+            <w:r>
+              <w:rPr>
+                <w:rFonts w:ascii="함초롬바탕" w:eastAsia="함초롬바탕" w:hAnsi="함초롬바탕" w:cs="함초롬바탕"/>
+                <w:color w:val="000000"/>
+                <w:sz w:val="20"/>
+                <w:szCs w:val="20"/>
+              </w:rPr>
+              <w:t>로</w:t>
+            </w:r>
+            <w:r>
+              <w:rPr>
+                <w:rFonts w:ascii="함초롬바탕" w:eastAsia="함초롬바탕" w:hAnsi="함초롬바탕" w:cs="함초롬바탕" w:hint="eastAsia"/>
+                <w:color w:val="000000"/>
+                <w:sz w:val="20"/>
+                <w:szCs w:val="20"/>
+              </w:rPr>
+              <w:t xml:space="preserve"> 확장).</w:t>
             </w:r>
           </w:p>
         </w:tc>
@@ -754,7 +841,6 @@
             </w:tcMar>
           </w:tcPr>
           <w:p>
-            <w:proofErr w:type="spellStart"/>
             <w:r>
               <w:rPr>
                 <w:rFonts w:eastAsia="Arial"/>
@@ -764,9 +850,64 @@
                 <w:sz w:val="20"/>
                 <w:szCs w:val="20"/>
               </w:rPr>
-              <w:t>액터</w:t>
-            </w:r>
-            <w:proofErr w:type="spellEnd"/>
+              <w:t>액터 (Actor)</w:t>
+            </w:r>
+          </w:p>
+        </w:tc>
+        <w:tc>
+          <w:tcPr>
+            <w:tcW w:w="7360" w:type="dxa"/>
+            <w:tcBorders>
+              <w:top w:val="single" w:sz="1" w:space="0" w:color="CCCCCC"/>
+              <w:left w:val="single" w:sz="1" w:space="0" w:color="CCCCCC"/>
+              <w:bottom w:val="single" w:sz="1" w:space="0" w:color="CCCCCC"/>
+              <w:right w:val="single" w:sz="1" w:space="0" w:color="CCCCCC"/>
+            </w:tcBorders>
+            <w:tcMar>
+              <w:top w:w="80" w:type="dxa"/>
+              <w:left w:w="150" w:type="dxa"/>
+              <w:bottom w:w="80" w:type="dxa"/>
+              <w:right w:w="150" w:type="dxa"/>
+            </w:tcMar>
+          </w:tcPr>
+          <w:p>
+            <w:pPr>
+              <w:rPr>
+                <w:rFonts w:ascii="함초롬바탕" w:eastAsia="함초롬바탕" w:hAnsi="함초롬바탕" w:cs="함초롬바탕"/>
+                <w:sz w:val="20"/>
+                <w:szCs w:val="20"/>
+              </w:rPr>
+            </w:pPr>
+            <w:r>
+              <w:rPr>
+                <w:rFonts w:ascii="함초롬바탕" w:eastAsia="함초롬바탕" w:hAnsi="함초롬바탕" w:cs="함초롬바탕" w:hint="eastAsia"/>
+                <w:sz w:val="20"/>
+                <w:szCs w:val="20"/>
+              </w:rPr>
+              <w:t>관리자</w:t>
+            </w:r>
+          </w:p>
+        </w:tc>
+      </w:tr>
+      <w:tr>
+        <w:tc>
+          <w:tcPr>
+            <w:tcW w:w="2000" w:type="dxa"/>
+            <w:tcBorders>
+              <w:top w:val="single" w:sz="1" w:space="0" w:color="CCCCCC"/>
+              <w:left w:val="single" w:sz="1" w:space="0" w:color="CCCCCC"/>
+              <w:bottom w:val="single" w:sz="1" w:space="0" w:color="CCCCCC"/>
+              <w:right w:val="single" w:sz="1" w:space="0" w:color="CCCCCC"/>
+            </w:tcBorders>
+            <w:shd w:val="clear" w:color="auto" w:fill="EEF2F8"/>
+            <w:tcMar>
+              <w:top w:w="80" w:type="dxa"/>
+              <w:left w:w="150" w:type="dxa"/>
+              <w:bottom w:w="80" w:type="dxa"/>
+              <w:right w:w="150" w:type="dxa"/>
+            </w:tcMar>
+          </w:tcPr>
+          <w:p>
             <w:r>
               <w:rPr>
                 <w:rFonts w:eastAsia="Arial"/>
@@ -776,7 +917,7 @@
                 <w:sz w:val="20"/>
                 <w:szCs w:val="20"/>
               </w:rPr>
-              <w:t xml:space="preserve"> (Actor)</w:t>
+              <w:t>목표 (Goal)</w:t>
             </w:r>
           </w:p>
         </w:tc>
@@ -810,98 +951,7 @@
                 <w:sz w:val="20"/>
                 <w:szCs w:val="20"/>
               </w:rPr>
-              <w:t>관리자</w:t>
-            </w:r>
-          </w:p>
-        </w:tc>
-      </w:tr>
-      <w:tr>
-        <w:tc>
-          <w:tcPr>
-            <w:tcW w:w="2000" w:type="dxa"/>
-            <w:tcBorders>
-              <w:top w:val="single" w:sz="1" w:space="0" w:color="CCCCCC"/>
-              <w:left w:val="single" w:sz="1" w:space="0" w:color="CCCCCC"/>
-              <w:bottom w:val="single" w:sz="1" w:space="0" w:color="CCCCCC"/>
-              <w:right w:val="single" w:sz="1" w:space="0" w:color="CCCCCC"/>
-            </w:tcBorders>
-            <w:shd w:val="clear" w:color="auto" w:fill="EEF2F8"/>
-            <w:tcMar>
-              <w:top w:w="80" w:type="dxa"/>
-              <w:left w:w="150" w:type="dxa"/>
-              <w:bottom w:w="80" w:type="dxa"/>
-              <w:right w:w="150" w:type="dxa"/>
-            </w:tcMar>
-          </w:tcPr>
-          <w:p>
-            <w:r>
-              <w:rPr>
-                <w:rFonts w:eastAsia="Arial"/>
-                <w:b/>
-                <w:bCs/>
-                <w:color w:val="2E5496"/>
-                <w:sz w:val="20"/>
-                <w:szCs w:val="20"/>
-              </w:rPr>
-              <w:t>목표 (Goal)</w:t>
-            </w:r>
-          </w:p>
-        </w:tc>
-        <w:tc>
-          <w:tcPr>
-            <w:tcW w:w="7360" w:type="dxa"/>
-            <w:tcBorders>
-              <w:top w:val="single" w:sz="1" w:space="0" w:color="CCCCCC"/>
-              <w:left w:val="single" w:sz="1" w:space="0" w:color="CCCCCC"/>
-              <w:bottom w:val="single" w:sz="1" w:space="0" w:color="CCCCCC"/>
-              <w:right w:val="single" w:sz="1" w:space="0" w:color="CCCCCC"/>
-            </w:tcBorders>
-            <w:tcMar>
-              <w:top w:w="80" w:type="dxa"/>
-              <w:left w:w="150" w:type="dxa"/>
-              <w:bottom w:w="80" w:type="dxa"/>
-              <w:right w:w="150" w:type="dxa"/>
-            </w:tcMar>
-          </w:tcPr>
-          <w:p>
-            <w:pPr>
-              <w:rPr>
-                <w:rFonts w:ascii="함초롬바탕" w:eastAsia="함초롬바탕" w:hAnsi="함초롬바탕" w:cs="함초롬바탕"/>
-                <w:sz w:val="20"/>
-                <w:szCs w:val="20"/>
-              </w:rPr>
-            </w:pPr>
-            <w:r>
-              <w:rPr>
-                <w:rFonts w:ascii="함초롬바탕" w:eastAsia="함초롬바탕" w:hAnsi="함초롬바탕" w:cs="함초롬바탕" w:hint="eastAsia"/>
-                <w:sz w:val="20"/>
-                <w:szCs w:val="20"/>
-              </w:rPr>
-              <w:t xml:space="preserve">등록된 설문을 관리하기 위함. </w:t>
-            </w:r>
-            <w:r>
-              <w:rPr>
-                <w:rFonts w:ascii="함초롬바탕" w:eastAsia="함초롬바탕" w:hAnsi="함초롬바탕" w:cs="함초롬바탕" w:hint="eastAsia"/>
-                <w:sz w:val="20"/>
-                <w:szCs w:val="20"/>
-              </w:rPr>
-              <w:t xml:space="preserve">원하는 설문의 </w:t>
-            </w:r>
-            <w:r>
-              <w:rPr>
-                <w:rFonts w:ascii="함초롬바탕" w:eastAsia="함초롬바탕" w:hAnsi="함초롬바탕" w:cs="함초롬바탕" w:hint="eastAsia"/>
-                <w:sz w:val="20"/>
-                <w:szCs w:val="20"/>
-              </w:rPr>
-              <w:t xml:space="preserve">상세 내용을 확인할 수 </w:t>
-            </w:r>
-            <w:r>
-              <w:rPr>
-                <w:rFonts w:ascii="함초롬바탕" w:eastAsia="함초롬바탕" w:hAnsi="함초롬바탕" w:cs="함초롬바탕" w:hint="eastAsia"/>
-                <w:sz w:val="20"/>
-                <w:szCs w:val="20"/>
-              </w:rPr>
-              <w:t>있다.</w:t>
+              <w:t>등록된 설문을 관리하기 위함. 원하는 설문의 상세 내용을 확인할 수 있다.</w:t>
             </w:r>
           </w:p>
         </w:tc>
@@ -1237,31 +1287,6 @@
         </w:tc>
       </w:tr>
     </w:tbl>
-    <w:p>
-      <w:pPr>
-        <w:spacing w:before="360" w:after="120"/>
-        <w:rPr>
-          <w:b/>
-          <w:bCs/>
-          <w:color w:val="2E5496"/>
-          <w:sz w:val="26"/>
-          <w:szCs w:val="26"/>
-        </w:rPr>
-      </w:pPr>
-    </w:p>
-    <w:p>
-      <w:pPr>
-        <w:spacing w:before="360" w:after="120"/>
-        <w:rPr>
-          <w:rFonts w:hint="eastAsia"/>
-          <w:b/>
-          <w:bCs/>
-          <w:color w:val="2E5496"/>
-          <w:sz w:val="26"/>
-          <w:szCs w:val="26"/>
-        </w:rPr>
-      </w:pPr>
-    </w:p>
     <w:p>
       <w:pPr>
         <w:spacing w:before="360" w:after="120"/>
@@ -1369,7 +1394,6 @@
             </w:tcMar>
           </w:tcPr>
           <w:p>
-            <w:proofErr w:type="spellStart"/>
             <w:r>
               <w:rPr>
                 <w:rFonts w:eastAsia="Arial"/>
@@ -1379,19 +1403,7 @@
                 <w:sz w:val="20"/>
                 <w:szCs w:val="20"/>
               </w:rPr>
-              <w:t>액터</w:t>
-            </w:r>
-            <w:proofErr w:type="spellEnd"/>
-            <w:r>
-              <w:rPr>
-                <w:rFonts w:eastAsia="Arial"/>
-                <w:b/>
-                <w:bCs/>
-                <w:color w:val="2E5496"/>
-                <w:sz w:val="20"/>
-                <w:szCs w:val="20"/>
-              </w:rPr>
-              <w:t xml:space="preserve"> (Actor)</w:t>
+              <w:t>액터 (Actor)</w:t>
             </w:r>
           </w:p>
         </w:tc>
@@ -1495,23 +1507,7 @@
                 <w:sz w:val="20"/>
                 <w:szCs w:val="20"/>
               </w:rPr>
-              <w:t xml:space="preserve">등록된 설문을 관리하기 위함. </w:t>
-            </w:r>
-            <w:r>
-              <w:rPr>
-                <w:rFonts w:ascii="함초롬바탕" w:eastAsia="함초롬바탕" w:hAnsi="함초롬바탕" w:cs="함초롬바탕" w:hint="eastAsia"/>
-                <w:sz w:val="20"/>
-                <w:szCs w:val="20"/>
-              </w:rPr>
-              <w:t>특정 설문 항목을 삭제</w:t>
-            </w:r>
-            <w:r>
-              <w:rPr>
-                <w:rFonts w:ascii="함초롬바탕" w:eastAsia="함초롬바탕" w:hAnsi="함초롬바탕" w:cs="함초롬바탕" w:hint="eastAsia"/>
-                <w:sz w:val="20"/>
-                <w:szCs w:val="20"/>
-              </w:rPr>
-              <w:t>할 수 있다.</w:t>
+              <w:t>등록된 설문을 관리하기 위함. 특정 설문 항목을 삭제할 수 있다.</w:t>
             </w:r>
           </w:p>
         </w:tc>
@@ -1749,25 +1745,7 @@
                 <w:sz w:val="20"/>
                 <w:szCs w:val="20"/>
               </w:rPr>
-              <w:t>삭제하고자 하는</w:t>
-            </w:r>
-            <w:r>
-              <w:rPr>
-                <w:rFonts w:ascii="함초롬바탕" w:eastAsia="함초롬바탕" w:hAnsi="함초롬바탕" w:cs="함초롬바탕" w:hint="eastAsia"/>
-                <w:color w:val="000000"/>
-                <w:sz w:val="20"/>
-                <w:szCs w:val="20"/>
-              </w:rPr>
-              <w:t xml:space="preserve"> 특정</w:t>
-            </w:r>
-            <w:r>
-              <w:rPr>
-                <w:rFonts w:ascii="함초롬바탕" w:eastAsia="함초롬바탕" w:hAnsi="함초롬바탕" w:cs="함초롬바탕" w:hint="eastAsia"/>
-                <w:color w:val="000000"/>
-                <w:sz w:val="20"/>
-                <w:szCs w:val="20"/>
-              </w:rPr>
-              <w:t xml:space="preserve"> 설문 항목의 삭제 버튼을 누른다.</w:t>
+              <w:t>삭제하고자 하는 특정 설문 항목의 삭제 버튼을 누른다.</w:t>
             </w:r>
           </w:p>
         </w:tc>
@@ -1849,7 +1827,7 @@
           <w:p>
             <w:pPr>
               <w:rPr>
-                <w:rFonts w:ascii="함초롬바탕" w:eastAsia="함초롬바탕" w:hAnsi="함초롬바탕" w:cs="함초롬바탕" w:hint="eastAsia"/>
+                <w:rFonts w:ascii="함초롬바탕" w:eastAsia="함초롬바탕" w:hAnsi="함초롬바탕" w:cs="함초롬바탕"/>
               </w:rPr>
             </w:pPr>
             <w:r>
@@ -1999,7 +1977,7 @@
           <w:p>
             <w:pPr>
               <w:rPr>
-                <w:rFonts w:ascii="함초롬바탕" w:eastAsia="함초롬바탕" w:hAnsi="함초롬바탕" w:cs="함초롬바탕" w:hint="eastAsia"/>
+                <w:rFonts w:ascii="함초롬바탕" w:eastAsia="함초롬바탕" w:hAnsi="함초롬바탕" w:cs="함초롬바탕"/>
               </w:rPr>
             </w:pPr>
             <w:r>
@@ -2130,7 +2108,6 @@
             </w:tcMar>
           </w:tcPr>
           <w:p>
-            <w:proofErr w:type="spellStart"/>
             <w:r>
               <w:rPr>
                 <w:rFonts w:eastAsia="Arial"/>
@@ -2140,19 +2117,7 @@
                 <w:sz w:val="20"/>
                 <w:szCs w:val="20"/>
               </w:rPr>
-              <w:t>액터</w:t>
-            </w:r>
-            <w:proofErr w:type="spellEnd"/>
-            <w:r>
-              <w:rPr>
-                <w:rFonts w:eastAsia="Arial"/>
-                <w:b/>
-                <w:bCs/>
-                <w:color w:val="2E5496"/>
-                <w:sz w:val="20"/>
-                <w:szCs w:val="20"/>
-              </w:rPr>
-              <w:t xml:space="preserve"> (Actor)</w:t>
+              <w:t>액터 (Actor)</w:t>
             </w:r>
           </w:p>
         </w:tc>
@@ -2414,7 +2379,7 @@
           <w:p>
             <w:pPr>
               <w:rPr>
-                <w:rFonts w:ascii="함초롬바탕" w:eastAsia="함초롬바탕" w:hAnsi="함초롬바탕" w:cs="함초롬바탕" w:hint="eastAsia"/>
+                <w:rFonts w:ascii="함초롬바탕" w:eastAsia="함초롬바탕" w:hAnsi="함초롬바탕" w:cs="함초롬바탕"/>
                 <w:color w:val="000000"/>
                 <w:sz w:val="20"/>
                 <w:szCs w:val="20"/>
@@ -2717,7 +2682,7 @@
           <w:p>
             <w:pPr>
               <w:rPr>
-                <w:rFonts w:ascii="함초롬바탕" w:eastAsia="함초롬바탕" w:hAnsi="함초롬바탕" w:cs="함초롬바탕" w:hint="eastAsia"/>
+                <w:rFonts w:ascii="함초롬바탕" w:eastAsia="함초롬바탕" w:hAnsi="함초롬바탕" w:cs="함초롬바탕"/>
               </w:rPr>
             </w:pPr>
             <w:r>
@@ -2812,7 +2777,6 @@
         </w:rPr>
         <w:t xml:space="preserve">8 </w:t>
       </w:r>
-      <w:proofErr w:type="spellStart"/>
       <w:r>
         <w:rPr>
           <w:rFonts w:hint="eastAsia"/>
@@ -2824,7 +2788,6 @@
         </w:rPr>
         <w:t>회원용</w:t>
       </w:r>
-      <w:proofErr w:type="spellEnd"/>
       <w:r>
         <w:rPr>
           <w:rFonts w:hint="eastAsia"/>
@@ -2931,7 +2894,6 @@
             </w:tcMar>
           </w:tcPr>
           <w:p>
-            <w:proofErr w:type="spellStart"/>
             <w:r>
               <w:rPr>
                 <w:rFonts w:eastAsia="Arial"/>
@@ -2941,19 +2903,7 @@
                 <w:sz w:val="20"/>
                 <w:szCs w:val="20"/>
               </w:rPr>
-              <w:t>액터</w:t>
-            </w:r>
-            <w:proofErr w:type="spellEnd"/>
-            <w:r>
-              <w:rPr>
-                <w:rFonts w:eastAsia="Arial"/>
-                <w:b/>
-                <w:bCs/>
-                <w:color w:val="2E5496"/>
-                <w:sz w:val="20"/>
-                <w:szCs w:val="20"/>
-              </w:rPr>
-              <w:t xml:space="preserve"> (Actor)</w:t>
+              <w:t>액터 (Actor)</w:t>
             </w:r>
           </w:p>
         </w:tc>
@@ -3046,7 +2996,7 @@
           <w:p>
             <w:pPr>
               <w:rPr>
-                <w:rFonts w:ascii="함초롬바탕" w:eastAsia="함초롬바탕" w:hAnsi="함초롬바탕" w:cs="함초롬바탕" w:hint="eastAsia"/>
+                <w:rFonts w:ascii="함초롬바탕" w:eastAsia="함초롬바탕" w:hAnsi="함초롬바탕" w:cs="함초롬바탕"/>
                 <w:sz w:val="20"/>
                 <w:szCs w:val="20"/>
               </w:rPr>
@@ -3264,7 +3214,7 @@
           <w:p>
             <w:pPr>
               <w:rPr>
-                <w:rFonts w:ascii="함초롬바탕" w:eastAsia="함초롬바탕" w:hAnsi="함초롬바탕" w:cs="함초롬바탕" w:hint="eastAsia"/>
+                <w:rFonts w:ascii="함초롬바탕" w:eastAsia="함초롬바탕" w:hAnsi="함초롬바탕" w:cs="함초롬바탕"/>
                 <w:color w:val="000000"/>
                 <w:sz w:val="20"/>
                 <w:szCs w:val="20"/>
@@ -3368,7 +3318,7 @@
           <w:p>
             <w:pPr>
               <w:rPr>
-                <w:rFonts w:ascii="함초롬바탕" w:eastAsia="함초롬바탕" w:hAnsi="함초롬바탕" w:cs="함초롬바탕" w:hint="eastAsia"/>
+                <w:rFonts w:ascii="함초롬바탕" w:eastAsia="함초롬바탕" w:hAnsi="함초롬바탕" w:cs="함초롬바탕"/>
               </w:rPr>
             </w:pPr>
             <w:r>
@@ -3481,7 +3431,6 @@
       <w:pPr>
         <w:spacing w:before="360" w:after="120"/>
         <w:rPr>
-          <w:rFonts w:hint="eastAsia"/>
           <w:i/>
           <w:iCs/>
           <w:color w:val="7F7F7F"/>
@@ -4279,6 +4228,7 @@
   <w:style w:type="character" w:default="1" w:styleId="a0">
     <w:name w:val="Default Paragraph Font"/>
     <w:uiPriority w:val="1"/>
+    <w:semiHidden/>
     <w:unhideWhenUsed/>
   </w:style>
   <w:style w:type="table" w:default="1" w:styleId="a1">

</xml_diff>